<commit_message>
Fix: {#harMotor/Ov/Jord} opening tags missing # prefix
Co-Authored-By: Claude Sonnet 4.6 <noreply@anthropic.com>
</commit_message>
<xml_diff>
--- a/template.docx
+++ b/template.docx
@@ -1939,7 +1939,7 @@
     </w:sectPr>
     <w:p>
       <w:r>
-        <w:t>{harMotor}</w:t>
+        <w:t>{#harMotor}</w:t>
       </w:r>
     </w:p>
     <w:p>
@@ -2066,7 +2066,7 @@
     </w:p>
     <w:p>
       <w:r>
-        <w:t>{harOv}</w:t>
+        <w:t>{#harOv}</w:t>
       </w:r>
     </w:p>
     <w:p>
@@ -2193,7 +2193,7 @@
     </w:p>
     <w:p>
       <w:r>
-        <w:t>{harJord}</w:t>
+        <w:t>{#harJord}</w:t>
       </w:r>
     </w:p>
     <w:p>

</xml_diff>